<commit_message>
Created json for future query configuration setup, updated documentation with new specifications.
</commit_message>
<xml_diff>
--- a/docs/DAW001 Analisys Wizard Design A2.docx
+++ b/docs/DAW001 Analisys Wizard Design A2.docx
@@ -262,6 +262,54 @@
           <w:iCs w:val="false"/>
           <w:u w:val="none"/>
         </w:rPr>
+        <w:tab/>
+      </w:r>
+      <w:r>
+        <w:rPr>
+          <w:rFonts w:eastAsia="Calibri" w:cs="Calibri" w:ascii="Arial Nova" w:hAnsi="Arial Nova"/>
+          <w:b w:val="false"/>
+          <w:bCs w:val="false"/>
+          <w:i w:val="false"/>
+          <w:iCs w:val="false"/>
+          <w:u w:val="none"/>
+        </w:rPr>
+        <w:t xml:space="preserve">1.5.)  Create a control flow for the queries. </w:t>
+      </w:r>
+      <w:r>
+        <w:rPr>
+          <w:rFonts w:eastAsia="Calibri" w:cs="Calibri" w:ascii="Arial Nova" w:hAnsi="Arial Nova"/>
+          <w:b w:val="false"/>
+          <w:bCs w:val="false"/>
+          <w:i w:val="false"/>
+          <w:iCs w:val="false"/>
+          <w:u w:val="none"/>
+        </w:rPr>
+        <w:t>(Incorporate a configuration file for determining the queries needed… Enter VIN → Read con</w:t>
+      </w:r>
+    </w:p>
+    <w:p>
+      <w:pPr>
+        <w:pStyle w:val="Normal"/>
+        <w:spacing w:lineRule="atLeast" w:line="300" w:before="0" w:after="0"/>
+        <w:rPr>
+          <w:rFonts w:ascii="Arial Nova" w:hAnsi="Arial Nova" w:eastAsia="Calibri" w:cs="Calibri"/>
+          <w:b w:val="false"/>
+          <w:bCs w:val="false"/>
+          <w:i w:val="false"/>
+          <w:i w:val="false"/>
+          <w:iCs w:val="false"/>
+          <w:u w:val="none"/>
+        </w:rPr>
+      </w:pPr>
+      <w:r>
+        <w:rPr>
+          <w:rFonts w:eastAsia="Calibri" w:cs="Calibri" w:ascii="Arial Nova" w:hAnsi="Arial Nova"/>
+          <w:b w:val="false"/>
+          <w:bCs w:val="false"/>
+          <w:i w:val="false"/>
+          <w:iCs w:val="false"/>
+          <w:u w:val="none"/>
+        </w:rPr>
         <w:t>2.) SQL Queries.</w:t>
       </w:r>
     </w:p>
@@ -409,55 +457,7 @@
           <w:iCs w:val="false"/>
           <w:u w:val="none"/>
         </w:rPr>
-        <w:t>Postgresql (</w:t>
-      </w:r>
-      <w:r>
-        <w:rPr>
-          <w:b w:val="false"/>
-          <w:bCs w:val="false"/>
-          <w:i w:val="false"/>
-          <w:iCs w:val="false"/>
-          <w:u w:val="none"/>
-        </w:rPr>
-        <w:t xml:space="preserve">SQL </w:t>
-      </w:r>
-      <w:r>
-        <w:rPr>
-          <w:b w:val="false"/>
-          <w:bCs w:val="false"/>
-          <w:i w:val="false"/>
-          <w:iCs w:val="false"/>
-          <w:u w:val="none"/>
-        </w:rPr>
-        <w:t>database/implementation)</w:t>
-      </w:r>
-    </w:p>
-    <w:p>
-      <w:pPr>
-        <w:pStyle w:val="Normal"/>
-        <w:numPr>
-          <w:ilvl w:val="0"/>
-          <w:numId w:val="6"/>
-        </w:numPr>
-        <w:spacing w:lineRule="atLeast" w:line="300" w:before="0" w:after="0"/>
-        <w:rPr>
-          <w:b w:val="false"/>
-          <w:bCs w:val="false"/>
-          <w:i w:val="false"/>
-          <w:i w:val="false"/>
-          <w:iCs w:val="false"/>
-          <w:u w:val="none"/>
-        </w:rPr>
-      </w:pPr>
-      <w:r>
-        <w:rPr>
-          <w:b w:val="false"/>
-          <w:bCs w:val="false"/>
-          <w:i w:val="false"/>
-          <w:iCs w:val="false"/>
-          <w:u w:val="none"/>
-        </w:rPr>
-        <w:t>Amazon RDS ?? (database hosting – long term after deployment)</w:t>
+        <w:t>Postgresql (SQL database/implementation)</w:t>
       </w:r>
     </w:p>
     <w:p>
@@ -513,27 +513,7 @@
           <w:iCs w:val="false"/>
           <w:u w:val="none"/>
         </w:rPr>
-        <w:t>psycopg (python/</w:t>
-      </w:r>
-      <w:r>
-        <w:rPr>
-          <w:b w:val="false"/>
-          <w:bCs w:val="false"/>
-          <w:i w:val="false"/>
-          <w:iCs w:val="false"/>
-          <w:u w:val="none"/>
-        </w:rPr>
-        <w:t>SQL</w:t>
-      </w:r>
-      <w:r>
-        <w:rPr>
-          <w:b w:val="false"/>
-          <w:bCs w:val="false"/>
-          <w:i w:val="false"/>
-          <w:iCs w:val="false"/>
-          <w:u w:val="none"/>
-        </w:rPr>
-        <w:t xml:space="preserve"> interface)</w:t>
+        <w:t>psycopg (python/SQL interface)</w:t>
       </w:r>
     </w:p>
     <w:p>
@@ -589,27 +569,7 @@
           <w:iCs w:val="false"/>
           <w:u w:val="none"/>
         </w:rPr>
-        <w:t xml:space="preserve">Pandas </w:t>
-      </w:r>
-      <w:r>
-        <w:rPr>
-          <w:b w:val="false"/>
-          <w:bCs w:val="false"/>
-          <w:i w:val="false"/>
-          <w:iCs w:val="false"/>
-          <w:u w:val="none"/>
-        </w:rPr>
-        <w:t xml:space="preserve">and NumPy </w:t>
-      </w:r>
-      <w:r>
-        <w:rPr>
-          <w:b w:val="false"/>
-          <w:bCs w:val="false"/>
-          <w:i w:val="false"/>
-          <w:iCs w:val="false"/>
-          <w:u w:val="none"/>
-        </w:rPr>
-        <w:t>(data processing)</w:t>
+        <w:t>Pandas and NumPy (data processing)</w:t>
       </w:r>
     </w:p>
     <w:p>
@@ -621,21 +581,18 @@
         </w:numPr>
         <w:spacing w:lineRule="atLeast" w:line="300" w:before="0" w:after="0"/>
         <w:rPr>
-          <w:b w:val="false"/>
-          <w:bCs w:val="false"/>
-          <w:i w:val="false"/>
+          <w:highlight w:val="none"/>
+          <w:shd w:fill="FFFF00" w:val="clear"/>
+        </w:rPr>
+      </w:pPr>
+      <w:r>
+        <w:rPr>
+          <w:b w:val="false"/>
+          <w:bCs w:val="false"/>
           <w:i w:val="false"/>
           <w:iCs w:val="false"/>
           <w:u w:val="none"/>
-        </w:rPr>
-      </w:pPr>
-      <w:r>
-        <w:rPr>
-          <w:b w:val="false"/>
-          <w:bCs w:val="false"/>
-          <w:i w:val="false"/>
-          <w:iCs w:val="false"/>
-          <w:u w:val="none"/>
+          <w:shd w:fill="FFFF00" w:val="clear"/>
         </w:rPr>
         <w:t>Matplotlib (displaying graphs)</w:t>
       </w:r>
@@ -4614,7 +4571,7 @@
     <w:pPr>
       <w:widowControl/>
       <w:suppressAutoHyphens w:val="true"/>
-      <w:overflowPunct w:val="true"/>
+      <w:overflowPunct w:val="false"/>
       <w:bidi w:val="0"/>
       <w:spacing w:lineRule="auto" w:line="259" w:before="0" w:after="160"/>
       <w:jc w:val="left"/>
@@ -5142,7 +5099,7 @@
     <w:pPr>
       <w:widowControl/>
       <w:suppressAutoHyphens w:val="true"/>
-      <w:overflowPunct w:val="true"/>
+      <w:overflowPunct w:val="false"/>
       <w:bidi w:val="0"/>
       <w:spacing w:lineRule="auto" w:line="240" w:before="0" w:after="0"/>
       <w:jc w:val="left"/>

</xml_diff>